<commit_message>
Replace repository URL placeholders with actual GitHub URL
Substitute [repository URL to be assigned upon publication] with
https://github.com/a1569928824-hue/-Green_Trade_Trilemma
in manuscript, revision, and Python sources (paras 75, 76, 78).

Co-Authored-By: Claude Opus 4.7 <noreply@anthropic.com>
</commit_message>
<xml_diff>
--- a/Green_Trade_Trilemma_Manuscript.docx
+++ b/Green_Trade_Trilemma_Manuscript.docx
@@ -1099,7 +1099,7 @@
           <w:sz w:val="24"/>
           <w:rFonts w:eastAsia="宋体"/>
         </w:rPr>
-        <w:t>The low-carbon technology trade database, de-risking policy inventory, and trilemma indices constructed for this study are available at [repository URL to be assigned upon publication]. The structural model code (Python/Julia) is available at the same repository. Source data for UN Comtrade are publicly available at https://comtrade.un.org; IRENA renewable capacity statistics at https://www.irena.org; and EXIOBASE MRIO tables at https://www.exiobase.eu.</w:t>
+        <w:t>The low-carbon technology trade database, de-risking policy inventory, and trilemma indices constructed for this study are available at [https://github.com/a1569928824-hue/-Green_Trade_Trilemma]. The structural model code (Python/Julia) is available at the same repository. Source data for UN Comtrade are publicly available at https://comtrade.un.org; IRENA renewable capacity statistics at https://www.irena.org; and EXIOBASE MRIO tables at https://www.exiobase.eu.</w:t>
       </w:r>
     </w:p>
     <w:p>
@@ -1127,7 +1127,7 @@
           <w:sz w:val="24"/>
           <w:rFonts w:eastAsia="宋体"/>
         </w:rPr>
-        <w:t>All analysis code—including data processing pipelines, econometric estimation, structural model calibration, and figure generation—is available at [repository URL to be assigned upon publication] under an MIT license.</w:t>
+        <w:t>All analysis code—including data processing pipelines, econometric estimation, structural model calibration, and figure generation—is available at [https://github.com/a1569928824-hue/-Green_Trade_Trilemma] under an MIT license.</w:t>
       </w:r>
     </w:p>
     <w:p>

</xml_diff>